<commit_message>
Cap nhat noi dung moi nhat cho bao cao Word Baocao_Nhom11_UDM10.docx
</commit_message>
<xml_diff>
--- a/DOCX/Baocao_Nhom11_UDM10.docx
+++ b/DOCX/Baocao_Nhom11_UDM10.docx
@@ -499,12 +499,6 @@
           <w:lang w:val="en-US"/>
         </w:rPr>
       </w:pPr>
-      <w:r>
-        <w:rPr>
-          <w:rFonts w:ascii="Times New Roman" w:hAnsi="Times New Roman" w:cs="Times New Roman" w:eastAsia="Times New Roman"/>
-        </w:rPr>
-        <w:t>Ngôn ngữ : C# 100% (.NET 10, WPF) — không dùng Web App, Python, Java hay C++</w:t>
-      </w:r>
     </w:p>
     <w:p>
       <w:pPr>
@@ -1673,7 +1667,7 @@
                 <w:sz w:val="24"/>
                 <w:szCs w:val="24"/>
               </w:rPr>
-              <w:t>C# WPF; chọn và kéo-thả file; trạng thái; nút thao tác; demo GUI; báo cáo Word; slide PPTX; dựng video demo</w:t>
+              <w:t>WPF; chọn và kéo-thả file; trạng thái;</w:t>
             </w:r>
             <w:r>
               <w:rPr>
@@ -1685,6 +1679,7 @@
                 <w:szCs w:val="24"/>
                 <w:lang w:val="en-US"/>
               </w:rPr>
+              <w:t xml:space="preserve"> các</w:t>
             </w:r>
             <w:r>
               <w:rPr>
@@ -1695,6 +1690,7 @@
                 <w:sz w:val="24"/>
                 <w:szCs w:val="24"/>
               </w:rPr>
+              <w:t xml:space="preserve"> nút thao tác; demo GUI</w:t>
             </w:r>
             <w:r>
               <w:rPr>
@@ -1706,6 +1702,7 @@
                 <w:szCs w:val="24"/>
                 <w:lang w:val="en-US"/>
               </w:rPr>
+              <w:t>; báo cáo word; slide ppt giới thiệu; edit video demo</w:t>
             </w:r>
           </w:p>
         </w:tc>
@@ -1910,7 +1907,7 @@
                 <w:sz w:val="24"/>
                 <w:szCs w:val="24"/>
               </w:rPr>
-              <w:t>C# Shared protocol; framing; validation metadata; tài liệu kỹ thuật</w:t>
+              <w:t>Shared protocol; framing; validation metadata; tài liệu kỹ thuật</w:t>
             </w:r>
           </w:p>
         </w:tc>
@@ -2109,7 +2106,7 @@
                 <w:sz w:val="24"/>
                 <w:szCs w:val="24"/>
               </w:rPr>
-              <w:t>C# Client TCP; hàng đợi và giới hạn đồng thời; Cancel/Retry; tích hợp; kiểm thử phát hiện lỗi</w:t>
+              <w:t>Client TCP; hàng đợi và giới hạn đồng thời; Cancel/Retry; tích hợp</w:t>
             </w:r>
             <w:r>
               <w:rPr>
@@ -2121,6 +2118,7 @@
                 <w:szCs w:val="24"/>
                 <w:lang w:val="en-US"/>
               </w:rPr>
+              <w:t>; kiểm thử phát hiện báo lỗi</w:t>
             </w:r>
           </w:p>
         </w:tc>
@@ -2329,7 +2327,7 @@
                 <w:sz w:val="24"/>
                 <w:szCs w:val="24"/>
               </w:rPr>
-              <w:t>C# TCP Server; session; timeout; graceful shutdown; logging</w:t>
+              <w:t>TCP Server; session; timeout; graceful shutdown; logging</w:t>
             </w:r>
           </w:p>
         </w:tc>
@@ -2534,7 +2532,7 @@
                 <w:sz w:val="24"/>
                 <w:szCs w:val="24"/>
               </w:rPr>
-              <w:t>C# chunk transfer; lưu trữ; SHA-256; thống kê; performance test</w:t>
+              <w:t>Chunk transfer; lưu trữ; SHA-256; thống kê; performance test</w:t>
             </w:r>
           </w:p>
         </w:tc>
@@ -5169,7 +5167,7 @@
           <w:color w:val="000000"/>
           <w:sz w:val="26"/>
         </w:rPr>
-        <w:t>Trong các bài tập socket cơ bản, dữ liệu thường chỉ là một chuỗi ngắn nên ít thấy các vấn đề xảy ra khi truyền file thật. Nhóm chọn UDM_10 vì bài toán upload nhiều file buộc phải xử lý rõ ràng: metadata kết thúc ở đâu, dữ liệu file bắt đầu lúc nào, file dang dở khi mất kết nối được xử lý ra sao, và giao diện khôngถูก đứng khi nhiều file cùng chạy. Toàn bộ mã nguồn Client, Server và thư viện dùng chung được viết bằng C# trên .NET 10; nhóm không dùng Web App và không dùng Python, Java hay C++.</w:t>
+        <w:t xml:space="preserve">Trong các bài tập socket cơ bản, dữ liệu thường chỉ là một chuỗi ngắn nên ít thấy các vấn đề xảy ra khi truyền file thật. Nhóm chọn </w:t>
       </w:r>
       <w:r>
         <w:rPr>
@@ -5180,6 +5178,7 @@
           <w:color w:val="000000"/>
           <w:sz w:val="26"/>
         </w:rPr>
+        <w:t>UDM_10</w:t>
       </w:r>
       <w:r>
         <w:rPr>
@@ -5189,6 +5188,7 @@
           <w:color w:val="000000"/>
           <w:sz w:val="26"/>
         </w:rPr>
+        <w:t xml:space="preserve"> vì bài toán upload nhiều file buộc chúng em xử lý rõ ràng hơn: phải biết metadata kết thúc ở đâu, dữ liệu file bắt đầu lúc nào, nếu đường truyền bị ngắt thì file dang dở được xử lý ra sao, và làm thế nào để giao diện không bị đứng khi nhiều file cùng chạy.</w:t>
       </w:r>
     </w:p>
     <w:p>
@@ -5209,7 +5209,7 @@
           <w:color w:val="000000"/>
           <w:sz w:val="26"/>
         </w:rPr>
-        <w:t>Kéo-thả nhiều file là thao tác quen thuộc trên ứng dụng desktop. Phía sau thao tác đó là hàng đợi, số lượt truyền đồng thời, tiến độ từng file và phản hồi từ Server qua TCP socket thật giữa hai tiến trình riêng. Phạm vi đề tài vừa đủ cho môn Lập trình mạng: có Client–Server, protocol riêng, xử lý bất đồng bộ và các tình huống lỗi có thể kiểm tra; không mở rộng thành hệ thống lưu trữ đám mây hay ứng dụng web.</w:t>
+        <w:t>Kéo-thả nhiều file cũng là thao tác quen thuộc trên ứng dụng desktop. Tuy nhiên, phía sau thao tác đó là hàng đợi, số lượt truyền đồng thời, tiến độ riêng của từng file và phản hồi từ Server. Vì vậy đề tài có phạm vi vừa đủ cho môn Lập trình mạng: không quá rộng như một hệ thống lưu trữ hoàn chỉnh, nhưng vẫn có Client, Server, protocol riêng, xử lý bất đồng bộ và các tình huống lỗi có thể kiểm tra được.</w:t>
       </w:r>
     </w:p>
     <w:p>
@@ -5252,7 +5252,7 @@
           <w:color w:val="000000"/>
           <w:sz w:val="26"/>
         </w:rPr>
-        <w:t>Mục tiêu chính là xây dựng ứng dụng desktop C# WPF trên Windows, cho phép chọn hoặc kéo-thả nhiều file rồi upload tới TCP Server. Client và Server phải là hai tiến trình riêng, giao tiếp qua mạng, không mô phỏng bằng gọi hàm nội bộ. Mỗi file có trạng thái và kết quả độc lập; một file lỗi hoặc bị hủy không làm dừng hàng đợi hay làm sập Server. Server nhận đúng số byte đã khai báo, kiểm tra SHA-256, không công nhận dữ liệu dở và không ghi đè file cũ khi trùng tên. IP, port, timeout và thư mục lưu phải cấu hình được, không hard-code cho một máy.</w:t>
+        <w:t>Mục tiêu chính của nhóm là xây dựng một ứng dụng WPF chạy trên Windows, cho phép người dùng chọn hoặc kéo-thả nhiều file rồi upload đến TCP Server. Mỗi file phải có trạng thái và kết quả độc lập. Một file lỗi hoặc bị hủy không được làm dừng toàn bộ hàng đợi. Phía Server phải nhận đúng số byte đã khai báo, kiểm tra SHA-256 và không ghi đè file cũ khi trùng tên.</w:t>
       </w:r>
     </w:p>
     <w:p>
@@ -5273,7 +5273,7 @@
           <w:color w:val="000000"/>
           <w:sz w:val="26"/>
         </w:rPr>
-        <w:t>Phạm vi thực hiện gồm GUI WPF, protocol V3, validation, timeout, log, Cancel/Retry và lưu file tạm .part. Ngoài phạm vi: Pause/Resume, upload thư mục, đăng nhập, TLS, cloud storage và điều khiển máy từ xa. Protocol phải có framing rõ ràng; request/response phải kiểm tra được; timeout tách lỗi mạng khỏi Cancel. Nhóm chia Client, GUI, Shared protocol, Server, storage và kiểm thử rồi tích hợp trên cùng solution C#. Tỷ lệ đóng góp được xác nhận ở bảng phân công.</w:t>
+        <w:t>Ngoài chức năng nhìn thấy trên giao diện, nhóm đặt thêm mục tiêu về khả năng giải thích. Protocol phải có framing rõ ràng, request và response phải kiểm tra được, timeout phải tách lỗi mạng khỏi thao tác Cancel, còn kết quả test phải đủ dữ liệu để đối chiếu. Trong quá trình làm, nhóm chia phần Client, GUI, Shared protocol, Server, storage và kiểm thử cho các thành viên rồi tích hợp trên cùng solution. Báo cáo này tập trung vào phiên bản đã tích hợp; tỷ lệ đóng góp cụ thể được xác nhận ở Bảng 1.</w:t>
       </w:r>
     </w:p>
     <w:p>
@@ -5476,7 +5476,7 @@
           <w:color w:val="000000"/>
           <w:sz w:val="26"/>
         </w:rPr>
-        <w:t>Solution C# gồm ba project. UDM10.Client là ứng dụng WPF, nhận chọn hoặc kéo-thả file, hiển thị danh sách và chuyển yêu cầu cho UploadManager. UDM10.Server là ứng dụng console, dùng TcpListener lắng nghe TCP, tạo ClientConnectionHandler cho từng kết nối rồi chuyển dữ liệu sang FileStorageService. UDM10.Shared chứa model request/response, enum trạng thái, framing, validation và hàm gửi file theo chunk. Cả ba project đều là C#; protocol dùng chung giúp Client và Server cùng phiên bản và cùng quy tắc kiểm tra. Một Client lỗi không làm Server hay Client khác dừng theo.</w:t>
+        <w:t>Solution gồm ba project. UDM10.Client là ứng dụng WPF, nhận thao tác chọn hoặc ké</w:t>
       </w:r>
       <w:bookmarkStart w:id="26" w:name="_GoBack"/>
       <w:r>
@@ -5487,6 +5487,7 @@
           <w:color w:val="000000"/>
           <w:sz w:val="26"/>
         </w:rPr>
+        <w:t>o-thả file, hiển thị danh sách và chuyển yêu cầu cho UploadManager. UDM10.Server là ứng dụng console, lắng nghe TCP, tạo ClientConnectionHandler cho từng kết nối rồi chuyển dữ liệu sang FileStorageService. UDM10.Shared chứa model request/response, enum trạn</w:t>
       </w:r>
       <w:bookmarkEnd w:id="26"/>
       <w:r>
@@ -5497,6 +5498,7 @@
           <w:color w:val="000000"/>
           <w:sz w:val="26"/>
         </w:rPr>
+        <w:t>g thái, framing, validation và hàm gửi file theo chunk. Việc để protocol trong project dùng chung giúp Client và Server sử dụng cùng phiên bản và cùng quy tắc kiểm tra.</w:t>
       </w:r>
     </w:p>
     <w:p>
@@ -5612,7 +5614,7 @@
           <w:color w:val="000000"/>
           <w:sz w:val="26"/>
         </w:rPr>
-        <w:t>Protocol ứng dụng là V3. Cổng mặc định 9000, IP và port đọc từ appsettings.json (Client có thể sửa trên GUI). Metadata request và response dùng framing 4 byte little-endian cho độ dài JSON, sau đó là đúng số byte JSON UTF-8. Độ dài metadata hợp lệ từ 1 đến 4096 byte. Bộ đọc gọi ReadAsync đến khi đủ prefix và payload vì TCP không giữ ranh giới message. Sau Ready, Client gửi raw binary đúng fileSize byte.</w:t>
+        <w:t>Phiên bản đang dùng là V3, cổng mặc định 9000. Metadata request và response có cùng framing: 4 byte đầu là số nguyên có dấu theo little-endian, cho biết độ dài JSON; sau đó là đúng số byte JSON UTF-8. Độ dài metadata hợp lệ từ 1 đến 4096 byte. Bộ đọc tiếp tục gọi ReadAsync đến khi đủ prefix và payload, vì một lần đọc từ NetworkStream không bảo đảm nhận đủ message.</w:t>
       </w:r>
     </w:p>
     <w:p>
@@ -6360,7 +6362,7 @@
           <w:color w:val="000000"/>
           <w:sz w:val="26"/>
         </w:rPr>
-        <w:t>UploadResponse có protocolVersion, requestId, status, errorCode, errorMessage và savedFileName. Client chỉ chấp nhận response đúng phiên bản và requestId. Ready/Completed phải có ErrorCode=None; Completed phải có savedFileName hợp lệ. Error phải có mã và thông báo, không kèm savedFileName. Các mã dùng trong code C#: None, InvalidMetadata, FileNameEmpty, FileSizeInvalid, ProtocolVersionMismatch, MissingRequestId, ConnectionLost, StorageError, CancelledByUser, ChecksumMismatch, UnsupportedStatus.</w:t>
+        <w:t>UploadResponse có protocolVersion, requestId, status, errorCode, errorMessage và savedFileName. Client chỉ chấp nhận response có đúng phiên bản và requestId của lượt hiện tại. Response Ready và Completed phải có ErrorCode=None; Completed phải có savedFileName hợp lệ. Response Error phải có mã lỗi và thông báo, đồng thời không được chứa savedFileName.</w:t>
       </w:r>
     </w:p>
     <w:p>
@@ -7489,7 +7491,7 @@
           <w:color w:val="000000"/>
           <w:sz w:val="26"/>
         </w:rPr>
-        <w:t>Server đọc đúng fileSize byte và ghi vào file .part, đồng thời tính SHA-256 trên dữ liệu nhận được. Thiếu byte, timeout, mất kết nối hoặc checksum sai thì session trả Error nếu còn kết nối và xóa file tạm; dữ liệu chưa đủ không được công nhận. Nếu hợp lệ, Server chọn tên không trùng, đổi thành file chính thức rồi gửi Completed kèm savedFileName. Socket, stream và file được giải phóng bằng using/Dispose. Server ghi log thời gian, Connect, Start, Completed, Error/Timeout và Disconnect; không ghi password hay secret. Source không chứa mật khẩu, khóa riêng hay dữ liệu nhạy cảm; demo chỉ dùng file giả lập.</w:t>
+        <w:t>Server đọc đúng fileSize byte và ghi dần vào file .part. Trong lúc ghi, Server tính SHA-256 trên chính dữ liệu nhận được. Nếu thiếu byte, timeout, mất kết nối hoặc checksum sai, session trả Error khi còn có thể và xóa file tạm. Nếu hợp lệ, Server chọn tên không trùng, đổi file tạm thành file chính thức rồi gửi Completed kèm savedFileName. Sau đó NetworkStream và socket được đóng. Server ghi log các sự kiện Connect, Start, Completed hoặc Error/Timeout và Disconnect.</w:t>
       </w:r>
     </w:p>
     <w:p>
@@ -7940,7 +7942,7 @@
           <w:color w:val="000000"/>
           <w:sz w:val="26"/>
         </w:rPr>
-        <w:t>Môi trường chạy chính thức là Windows 10/11 hoặc Windows VM có .NET 10 SDK. Toàn bộ chương trình là C#; Client WPF không chạy trực tiếp trên macOS/Linux. Có thể quản lý source trên máy khác, nhưng build GUI, chạy hai tiến trình và demo phải thực hiện trên Windows. Khi demo, ghi rõ OS, CPU, RAM, phiên bản .NET SDK và điều kiện mạng (loopback hay LAN) vào biên bản kiểm thử trong Extra.</w:t>
+        <w:t>Môi trường chạy chính thức là Windows 10/11 hoặc Windows VM có .NET 10 SDK. WPF không chạy trực tiếp trên macOS/Linux. Nhóm có thể quản lý source trên macOS, nhưng bước build, chạy GUI và nghiệm thu cuối phải thực hiện trong Windows. Thông tin máy ảo cụ thể cần bổ sung: [ĐIỀN: phần mềm VM, phiên bản Windows, cấu hình CPU/RAM và .NET SDK].</w:t>
       </w:r>
     </w:p>
     <w:p>
@@ -9339,7 +9341,7 @@
           <w:color w:val="000000"/>
           <w:sz w:val="26"/>
         </w:rPr>
-        <w:t>Mở PowerShell tại thư mục Code, chạy dotnet restore .\UDM10.sln và dotnet build .\UDM10.sln -c Release --no-restore. Sau khi 0 error, mở hai cửa sổ PowerShell riêng. Cửa sổ 1 chạy Server: dotnet run --project .\Server\UDM10.Server.csproj -c Release. Khi log báo đã lắng nghe, cửa sổ 2 chạy Client: dotnet run --project .\Client\UDM10.Client.csproj -c Release. Đây là hai tiến trình C# riêng, giao tiếp qua TCP, không gọi hàm nội bộ giữa Client và Server.</w:t>
+        <w:t>Mở PowerShell tại thư mục Code, chạy dotnet restore .\UDM10.sln và dotnet build .\UDM10.sln -c Release --no-restore. Sau khi build không có lỗi, mở hai cửa sổ PowerShell. Cửa sổ thứ nhất chạy Server bằng dotnet run --project .\Server\UDM10.Server.csproj -c Release. Khi log báo đã lắng nghe, cửa sổ thứ hai chạy Client bằng dotnet run --project .\Client\UDM10.Client.csproj -c Release.</w:t>
       </w:r>
     </w:p>
     <w:p>
@@ -9442,7 +9444,7 @@
           <w:color w:val="000000"/>
           <w:sz w:val="26"/>
         </w:rPr>
-        <w:t>Nhóm tách kiểm thử thành bốn nhóm: chức năng GUI, dữ liệu không hợp lệ, mất kết nối và tải/hiệu năng. Mỗi ca ghi môi trường, commit, dữ liệu đầu vào, số Client, số lượt đồng thời, kết quả mong đợi, kết quả thực tế và đường dẫn bằng chứng. File test case chi tiết nằm tại Extra/Test_Case_LTM_Project_5_Tuan.xlsx. Ảnh GUI và log Server được trình bày tại Hình 3–6.</w:t>
+        <w:t>Nhóm tách kiểm thử thành bốn nhóm: chức năng trên GUI, dữ liệu không hợp lệ ở protocol, lỗi kết nối và tải/hiệu năng. Mỗi ca cần ghi môi trường, commit, dữ liệu đầu vào, số Client, số lượt đồng thời, kết quả mong đợi, kết quả thực tế và đường dẫn bằng chứng. Cách ghi này quan trọng vì cùng một con số throughput sẽ có ý nghĩa khác nhau giữa loopback, LAN và máy ảo.</w:t>
       </w:r>
     </w:p>
     <w:p>
@@ -10566,7 +10568,7 @@
           <w:color w:val="000000"/>
           <w:sz w:val="26"/>
         </w:rPr>
-        <w:t>Solution build Release đạt 0 warning, 0 error. Bộ kiểm thử kỹ thuật protocol, storage, timeout và scheduler đạt 11/11 ca (12/09/2026). Probe TCP xác nhận metadata sai nhận Error, log Server có Error và Disconnect, Ctrl+C shutdown có chờ session. Video demo có âm thanh, từng thành viên trình bày phần việc và hiện khuôn mặt: https://youtu.be/lFGhi14CTBE. Kết quả throughput hai mức tải được nêu ở mục 7.2; đo trên loopback một Client nên không suy ra LAN nhiều Client.</w:t>
+        <w:t>README hiện ghi nhận solution build Release sạch với 0 warning, 0 error và bộ test riêng đạt 11/11 ca protocol, storage, send timeout và scheduler vào ngày 12/09/2026. Probe TCP trực tiếp cũng xác nhận status request sai nhận Error, log Server có Error và Disconnect, Ctrl+C thực hiện shutdown có chờ session. Đây là kết quả rà soát kỹ thuật; nhóm vẫn phải bổ sung ảnh, log và kết quả GUI/LAN trên Windows trước khi xem là nghiệm thu chính thức.</w:t>
       </w:r>
     </w:p>
     <w:p>
@@ -10681,7 +10683,7 @@
           <w:color w:val="000000"/>
           <w:sz w:val="26"/>
         </w:rPr>
-        <w:t>Nhóm thực hiện performance test với hai mức tải khác nhau trên TCP loopback, một Client, tuần tự. Throughput = tổng byte truyền thành công / thời gian đo. Tỷ lệ lỗi = số file thất bại / tổng số file. Cả hai mức đều đối chiếu kích thước và SHA-256; upload thiếu byte bị từ chối và file .part được dọn. Đây là chỉ số throughput (MB/s) của tiến trình C# Server/Client trên cùng máy, không phải số Client đồng thời trên LAN.</w:t>
+        <w:t>Để tránh báo cáo một con số đẹp nhưng thiếu bối cảnh, nhóm dùng ít nhất hai mức tải và giữ rõ điều kiện đo. Mức 1 kiểm tra tải vừa; mức 2 tăng tổng dung lượng và số Client. Trong mỗi lần chạy, throughput được tính bằng tổng byte truyền thành công chia cho thời gian đo. Tỷ lệ lỗi bằng số file thất bại chia cho tổng số file. CPU và RAM cần lấy trong cùng khoảng thời gian test, không lấy số đo khi hệ thống rảnh.</w:t>
       </w:r>
     </w:p>
     <w:p>
@@ -11378,7 +11380,7 @@
           <w:color w:val="000000"/>
           <w:sz w:val="26"/>
         </w:rPr>
-        <w:t>Mức A (32 MiB, chunk 64 KiB) đạt 868,24 MB/s; mức B (512 MiB, chunk 256 KiB) đạt 1495,09 MB/s; tỷ lệ lỗi 0% trên các lượt đo thành công. Mức B đổi cả kích thước file và chunk nên không tách được ảnh hưởng từng biến. Stress nhiều Client trên LAN chưa được đo trong bảng này; khi demo hai máy, nhóm xác nhận bằng log và GUI chứ không dùng lại số loopback.</w:t>
+        <w:t>Hai mức benchmark trên đã đối chiếu kích thước và SHA-256, đồng thời kiểm tra upload thiếu byte bị dọn. Tuy nhiên chúng không phải stress test nhiều Client. Do đó nhóm cần chạy lại hai mức bên dưới trên Windows và điền số liệu đo thực tế. Nếu kết quả khác với benchmark kỹ thuật, báo cáo phải giữ nguyên điều kiện đo thay vì chọn con số cao hơn.</w:t>
       </w:r>
     </w:p>
     <w:p>
@@ -11421,7 +11423,7 @@
           <w:color w:val="000000"/>
           <w:sz w:val="26"/>
         </w:rPr>
-        <w:t>Nhóm đã hoàn thành ứng dụng upload nhiều file viết 100% bằng C#: Client WPF tính hash, gửi metadata, chờ Ready, truyền dữ liệu, nhận Completed và hiện tên file Server đã lưu. Giao diện nhận nhiều file bằng hộp thoại hoặc kéo-thả, lập hàng đợi, tối đa ba upload đồng thời, Cancel/Retry từng file và hàng loạt. Lỗi một file ở đúng dòng đó, GUI không treo, dispatcher không dừng. Trạng thái kết nối, đang xử lý, thành công và thất bại đều hiển thị trên giao diện.</w:t>
+        <w:t>Phiên bản hiện tại đã hình thành đầy đủ một luồng upload qua TCP: Client tính hash, gửi metadata, chờ Ready, truyền dữ liệu, nhận Completed và hiển thị tên Server đã lưu. Giao diện nhận nhiều file bằng hộp thoại hoặc kéo-thả, tự lập hàng đợi, giới hạn ba upload đồng thời, cho phép Cancel/Retry từng file và thao tác hàng loạt. Lỗi một file được giữ ở chính dòng đó nên không làm dừng dispatcher.</w:t>
       </w:r>
     </w:p>
     <w:p>
@@ -11442,7 +11444,7 @@
           <w:color w:val="000000"/>
           <w:sz w:val="26"/>
         </w:rPr>
-        <w:t>Server C# kiểm tra version, requestId, tên file, kích thước, hash và status trước khi nhận dữ liệu; có timeout; ghi .part; xác minh SHA-256; đổi tên trùng; ghi log sự kiện chính. Build Release sạch và 11/11 kiểm thử kỹ thuật đạt. Video demo và link GitHub đã cung cấp. Giới hạn còn lại thuộc phạm vi chưa làm (Pause/Resume, TLS, nhiều Client stress trên LAN), được nêu rõ ở mục 11, không phải thiếu luồng upload bắt buộc.</w:t>
+        <w:t>Phía Server có validation cho version, requestId, tên file, kích thước, hash và status; có timeout khi chờ metadata hoặc dữ liệu; ghi file tạm, xác minh SHA-256 và giải quyết trùng tên. Kết quả rà soát trong README cho thấy build Release sạch và 11/11 kiểm thử kỹ thuật đã chạy đạt. Phần còn thiếu chủ yếu là bằng chứng nghiệm thu GUI, LAN và stress chính thức trên Windows, không phải thiếu luồng upload cơ bản.</w:t>
       </w:r>
     </w:p>
     <w:p>
@@ -11645,7 +11647,7 @@
           <w:color w:val="000000"/>
           <w:sz w:val="26"/>
         </w:rPr>
-        <w:t>Qua đề tài, nhóm nắm vững C# trên .NET 10: TcpListener/TcpClient, NetworkStream, async/await, CancellationToken, SemaphoreSlim, SHA-256, WPF MVVM đơn giản và quản lý vòng đời socket/file. Nhóm hiểu khác biệt giữa luồng byte TCP và message tầng ứng dụng, tự định nghĩa framing length-prefix + JSON và kiểm tra dữ liệu ở cả hai phía.</w:t>
+        <w:t>Qua đề tài, nhóm hiểu rõ hơn sự khác nhau giữa luồng byte TCP và message ở tầng ứng dụng. Các thành viên phải tự định nghĩa framing, kiểm tra dữ liệu ở cả hai phía và theo dõi vòng đời của socket. Nhóm cũng thực hành async/await, CancellationToken, SemaphoreSlim, xử lý I/O theo chunk và quản lý trạng thái trên WPF theo hướng MVVM đơn giản.</w:t>
       </w:r>
     </w:p>
     <w:p>
@@ -11937,7 +11939,7 @@
                 <w:sz w:val="24"/>
                 <w:szCs w:val="24"/>
               </w:rPr>
-              <w:t>Toàn bộ source C#; chọn/kéo-thả nhiều file; queue; tối đa 3 upload/Client; progress/tốc độ; Cancel/Retry; protocol V3; validation; timeout; SHA-256; .part; đổi tên trùng; log; thống kê.</w:t>
+              <w:t>Chọn/kéo-thả nhiều file; queue; tối đa 3 upload/Client; progress/tốc độ; Cancel/Retry; protocol V3; validation; timeout; SHA-256; .part; đổi tên trùng; log; thống kê.</w:t>
             </w:r>
           </w:p>
         </w:tc>
@@ -12031,7 +12033,7 @@
                 <w:sz w:val="24"/>
                 <w:szCs w:val="24"/>
               </w:rPr>
-              <w:t>Build Release 0 warning, 0 error; bộ test kỹ thuật 11/11; performance hai mức tải loopback (32 MiB và 512 MiB); video demo đã đăng.</w:t>
+              <w:t>Build Release 0 warning, 0 error; bộ test riêng 11/11; benchmark loopback hai mức theo README ngày 12/09/2026.</w:t>
             </w:r>
           </w:p>
         </w:tc>
@@ -12088,7 +12090,7 @@
                 <w:sz w:val="24"/>
                 <w:szCs w:val="24"/>
               </w:rPr>
-              <w:t>Bằng chứng bổ sung khi thuyết trình</w:t>
+              <w:t>Chờ nghiệm thu</w:t>
             </w:r>
           </w:p>
         </w:tc>
@@ -12123,7 +12125,7 @@
                 <w:sz w:val="24"/>
                 <w:szCs w:val="24"/>
               </w:rPr>
-              <w:t>Số liệu CPU/RAM khi stress nhiều Client trên LAN; cấu hình máy demo ghi kèm Extra nếu chạy hai máy thật.</w:t>
+              <w:t>GUI WPF trên Windows; kết nối LAN/hai VM; stress nhiều Client; số liệu CPU/RAM/tỷ lệ lỗi; ảnh và video demo.</w:t>
             </w:r>
           </w:p>
         </w:tc>
@@ -12217,7 +12219,7 @@
                 <w:sz w:val="24"/>
                 <w:szCs w:val="24"/>
               </w:rPr>
-              <w:t>Pause/Resume; upload thư mục; xác thực người dùng; TLS; mã hóa đầu cuối; lưu queue sau khi đóng Client; giới hạn tổng kết nối Server; tự dọn .part cũ sau khi Server bị kill hoặc mất điện; Web App và ngôn ngữ khác ngoài C#.</w:t>
+              <w:t>Pause/Resume; upload thư mục; xác thực người dùng; TLS; mã hóa đầu cuối; lưu queue sau khi đóng Client; giới hạn tổng kết nối Server; tự dọn .part cũ sau khi Server bị kill hoặc mất điện.</w:t>
             </w:r>
           </w:p>
         </w:tc>
@@ -12254,7 +12256,7 @@
           <w:color w:val="000000"/>
           <w:sz w:val="26"/>
         </w:rPr>
-        <w:t>Giới hạn ba file chỉ áp dụng cho một Client; Server chưa chặn tổng tải bằng ServerBusy. Retry gửi lại toàn bộ file, chưa resume từ offset. SaveDirectory là thư mục cục bộ, không phải cloud. Không có Web App, không có mã Python/Java/C++. Các giới hạn này không làm sai chức năng chính của UDM_10 nhưng phải nói rõ khi thuyết trình.</w:t>
+        <w:t>Giới hạn ba file chỉ áp dụng cho một Client; Server chưa có cơ chế ServerBusy dựa trên tổng tải. Mỗi Retry gửi lại toàn bộ file, chưa resume từ offset. SaveDirectory là thư mục cục bộ của Server, chưa phải cloud storage. Các giới hạn này không làm sai chức năng chính của UDM_10, nhưng cần nói rõ khi thuyết trình để phạm vi sản phẩm không bị hiểu rộng hơn code hiện có.</w:t>
       </w:r>
     </w:p>
     <w:p>
@@ -12310,7 +12312,7 @@
           <w:color w:val="0070C0"/>
           <w:lang w:val="en-US"/>
         </w:rPr>
-        <w:t>https://youtu.be/lFGhi14CTBE  (YouTube; mỗi thành viên trình bày phần việc của mình và hiển thị khuôn mặt)</w:t>
+        <w:fldChar w:fldCharType="begin"/>
       </w:r>
       <w:r>
         <w:rPr>
@@ -12318,6 +12320,7 @@
           <w:color w:val="0070C0"/>
           <w:lang w:val="en-US"/>
         </w:rPr>
+        <w:instrText xml:space="preserve"> HYPERLINK "https://youtu.be/lFGhi14CTBE" </w:instrText>
       </w:r>
       <w:r>
         <w:rPr>
@@ -12325,6 +12328,7 @@
           <w:color w:val="0070C0"/>
           <w:lang w:val="en-US"/>
         </w:rPr>
+        <w:fldChar w:fldCharType="separate"/>
       </w:r>
       <w:r>
         <w:rPr>
@@ -12333,6 +12337,7 @@
           <w:color w:val="0070C0"/>
           <w:lang w:val="en-US"/>
         </w:rPr>
+        <w:t>https://youtu.be/lFGhi14CTBE</w:t>
       </w:r>
       <w:r>
         <w:rPr>
@@ -12340,6 +12345,7 @@
           <w:color w:val="0070C0"/>
           <w:lang w:val="en-US"/>
         </w:rPr>
+        <w:fldChar w:fldCharType="end"/>
       </w:r>
     </w:p>
     <w:p>

</xml_diff>